<commit_message>
modified TechStack and Measuring Success document to include new technologies and updated success metrics.
</commit_message>
<xml_diff>
--- a/Project Description/TechStack and Measuring Success..docx
+++ b/Project Description/TechStack and Measuring Success..docx
@@ -64,6 +64,178 @@
           <w14:ligatures w14:val="none"/>
         </w:rPr>
         <w:t>, will handle API requests, data aggregation, and communication with external services. A cloud-hosted database such as Firebase, MongoDB Atlas, or PostgreSQL on AWS RDS will store station metadata, user preferences, and cached results to improve performance. Together, this tech stack creates a scalable, intuitive, and reliable application that enhances everyday travel planning.</w:t>
+      </w:r>
+    </w:p>
+    <w:p>
+      <w:pPr>
+        <w:spacing w:before="100" w:beforeAutospacing="1" w:after="100" w:afterAutospacing="1" w:line="240" w:lineRule="auto"/>
+        <w:ind w:firstLine="720"/>
+        <w:outlineLvl w:val="1"/>
+        <w:rPr>
+          <w:rFonts w:eastAsia="Times New Roman" w:cs="Times New Roman"/>
+          <w:kern w:val="0"/>
+          <w14:ligatures w14:val="none"/>
+        </w:rPr>
+      </w:pPr>
+      <w:r>
+        <w:rPr>
+          <w:rFonts w:eastAsia="Times New Roman" w:cs="Times New Roman"/>
+          <w:kern w:val="0"/>
+          <w14:ligatures w14:val="none"/>
+        </w:rPr>
+        <w:t xml:space="preserve">The application </w:t>
+      </w:r>
+      <w:r>
+        <w:rPr>
+          <w:rFonts w:eastAsia="Times New Roman" w:cs="Times New Roman"/>
+          <w:kern w:val="0"/>
+          <w14:ligatures w14:val="none"/>
+        </w:rPr>
+        <w:t>will be completed as</w:t>
+      </w:r>
+      <w:r>
+        <w:rPr>
+          <w:rFonts w:eastAsia="Times New Roman" w:cs="Times New Roman"/>
+          <w:kern w:val="0"/>
+          <w14:ligatures w14:val="none"/>
+        </w:rPr>
+        <w:t xml:space="preserve"> successfully</w:t>
+      </w:r>
+      <w:r>
+        <w:rPr>
+          <w:rFonts w:eastAsia="Times New Roman" w:cs="Times New Roman"/>
+          <w:kern w:val="0"/>
+          <w14:ligatures w14:val="none"/>
+        </w:rPr>
+        <w:t xml:space="preserve"> once it has</w:t>
+      </w:r>
+      <w:r>
+        <w:rPr>
+          <w:rFonts w:eastAsia="Times New Roman" w:cs="Times New Roman"/>
+          <w:kern w:val="0"/>
+          <w14:ligatures w14:val="none"/>
+        </w:rPr>
+        <w:t xml:space="preserve"> met its core functionality goals, reliably retrieving and displaying nearby stations with accurate distance and pricing information, all of which load without errors.</w:t>
+      </w:r>
+      <w:r>
+        <w:rPr>
+          <w:rFonts w:eastAsia="Times New Roman" w:cs="Times New Roman"/>
+          <w:kern w:val="0"/>
+          <w14:ligatures w14:val="none"/>
+        </w:rPr>
+        <w:t xml:space="preserve"> We can verify that the</w:t>
+      </w:r>
+      <w:r>
+        <w:rPr>
+          <w:rFonts w:eastAsia="Times New Roman" w:cs="Times New Roman"/>
+          <w:kern w:val="0"/>
+          <w14:ligatures w14:val="none"/>
+        </w:rPr>
+        <w:t xml:space="preserve"> Google Maps redirection works consistently, ensuring seamless navigation for users. From a UI/UX perspective, the interface is clean, responsive, and intuitive, while map interactions such as zooming, panning, and marker selection feel smooth and natural. </w:t>
+      </w:r>
+      <w:r>
+        <w:rPr>
+          <w:rFonts w:eastAsia="Times New Roman" w:cs="Times New Roman"/>
+          <w:kern w:val="0"/>
+          <w14:ligatures w14:val="none"/>
+        </w:rPr>
+        <w:t xml:space="preserve">If it was to be </w:t>
+      </w:r>
+      <w:r>
+        <w:rPr>
+          <w:rFonts w:eastAsia="Times New Roman" w:cs="Times New Roman"/>
+          <w:kern w:val="0"/>
+          <w14:ligatures w14:val="none"/>
+        </w:rPr>
+        <w:t>launch</w:t>
+      </w:r>
+      <w:r>
+        <w:rPr>
+          <w:rFonts w:eastAsia="Times New Roman" w:cs="Times New Roman"/>
+          <w:kern w:val="0"/>
+          <w14:ligatures w14:val="none"/>
+        </w:rPr>
+        <w:t>ed</w:t>
+      </w:r>
+      <w:r>
+        <w:rPr>
+          <w:rFonts w:eastAsia="Times New Roman" w:cs="Times New Roman"/>
+          <w:kern w:val="0"/>
+          <w14:ligatures w14:val="none"/>
+        </w:rPr>
+        <w:t xml:space="preserve">, the shipped version demonstrates strong performance, with average API response times remaining under 500 milliseconds and map and station data loading within two seconds. </w:t>
+      </w:r>
+      <w:r>
+        <w:rPr>
+          <w:rFonts w:eastAsia="Times New Roman" w:cs="Times New Roman"/>
+          <w:kern w:val="0"/>
+          <w14:ligatures w14:val="none"/>
+        </w:rPr>
+        <w:t>Then when it comes to u</w:t>
+      </w:r>
+      <w:r>
+        <w:rPr>
+          <w:rFonts w:eastAsia="Times New Roman" w:cs="Times New Roman"/>
+          <w:kern w:val="0"/>
+          <w14:ligatures w14:val="none"/>
+        </w:rPr>
+        <w:t xml:space="preserve">ser engagement metrics indicate healthy adoption, reflected in steady daily active users and frequent station lookups per session. </w:t>
+      </w:r>
+      <w:r>
+        <w:rPr>
+          <w:rFonts w:eastAsia="Times New Roman" w:cs="Times New Roman"/>
+          <w:kern w:val="0"/>
+          <w14:ligatures w14:val="none"/>
+        </w:rPr>
+        <w:t>Lastly, i</w:t>
+      </w:r>
+      <w:r>
+        <w:rPr>
+          <w:rFonts w:eastAsia="Times New Roman" w:cs="Times New Roman"/>
+          <w:kern w:val="0"/>
+          <w14:ligatures w14:val="none"/>
+        </w:rPr>
+        <w:t xml:space="preserve">n terms of reliability, the application maintains 99% uptime over a </w:t>
+      </w:r>
+      <w:r>
+        <w:rPr>
+          <w:rFonts w:eastAsia="Times New Roman" w:cs="Times New Roman"/>
+          <w:kern w:val="0"/>
+          <w14:ligatures w14:val="none"/>
+        </w:rPr>
+        <w:t>7-</w:t>
+      </w:r>
+      <w:r>
+        <w:rPr>
+          <w:rFonts w:eastAsia="Times New Roman" w:cs="Times New Roman"/>
+          <w:kern w:val="0"/>
+          <w14:ligatures w14:val="none"/>
+        </w:rPr>
+        <w:t xml:space="preserve">day period, with API error rates kept below </w:t>
+      </w:r>
+      <w:r>
+        <w:rPr>
+          <w:rFonts w:eastAsia="Times New Roman" w:cs="Times New Roman"/>
+          <w:kern w:val="0"/>
+          <w14:ligatures w14:val="none"/>
+        </w:rPr>
+        <w:t>5</w:t>
+      </w:r>
+      <w:r>
+        <w:rPr>
+          <w:rFonts w:eastAsia="Times New Roman" w:cs="Times New Roman"/>
+          <w:kern w:val="0"/>
+          <w14:ligatures w14:val="none"/>
+        </w:rPr>
+        <w:t>%. Overall user satisfaction is high, supported by positive feedback from user surveys</w:t>
+      </w:r>
+      <w:r>
+        <w:rPr>
+          <w:rFonts w:eastAsia="Times New Roman" w:cs="Times New Roman"/>
+          <w:kern w:val="0"/>
+          <w14:ligatures w14:val="none"/>
+        </w:rPr>
+        <w:t xml:space="preserve">. </w:t>
       </w:r>
     </w:p>
     <w:p>
@@ -624,6 +796,7 @@
           <w:kern w:val="0"/>
           <w14:ligatures w14:val="none"/>
         </w:rPr>
+        <w:lastRenderedPageBreak/>
         <w:t>DevOps / Tooling</w:t>
       </w:r>
     </w:p>
@@ -910,7 +1083,6 @@
           <w:kern w:val="0"/>
           <w14:ligatures w14:val="none"/>
         </w:rPr>
-        <w:lastRenderedPageBreak/>
         <w:t>UI/UX Quality:</w:t>
       </w:r>
     </w:p>
@@ -1402,6 +1574,7 @@
           <w:b/>
           <w:bCs/>
         </w:rPr>
+        <w:lastRenderedPageBreak/>
         <w:t>API Picker (helps choose the right APIs):</w:t>
       </w:r>
       <w:r>

</xml_diff>

<commit_message>
Slight modification to tech stack section.
</commit_message>
<xml_diff>
--- a/Project Description/TechStack and Measuring Success..docx
+++ b/Project Description/TechStack and Measuring Success..docx
@@ -47,16 +47,14 @@
         <w:noBreakHyphen/>
         <w:t>turn navigation. A clean, responsive frontend—built with frameworks like React or Vue—will display station distance, current fuel or charging prices, and user-selected route options. The backend, powered by Node.js with Express or Python Flask/</w:t>
       </w:r>
-      <w:proofErr w:type="spellStart"/>
-      <w:r>
-        <w:rPr>
-          <w:rFonts w:eastAsia="Times New Roman" w:cs="Times New Roman"/>
-          <w:kern w:val="0"/>
-          <w14:ligatures w14:val="none"/>
-        </w:rPr>
-        <w:t>FastAPI</w:t>
-      </w:r>
-      <w:proofErr w:type="spellEnd"/>
+      <w:r>
+        <w:rPr>
+          <w:rFonts w:eastAsia="Times New Roman" w:cs="Times New Roman"/>
+          <w:kern w:val="0"/>
+          <w14:ligatures w14:val="none"/>
+        </w:rPr>
+        <w:t>Fast API</w:t>
+      </w:r>
       <w:r>
         <w:rPr>
           <w:rFonts w:eastAsia="Times New Roman" w:cs="Times New Roman"/>
@@ -91,7 +89,15 @@
           <w:kern w:val="0"/>
           <w14:ligatures w14:val="none"/>
         </w:rPr>
-        <w:t>will be completed as</w:t>
+        <w:t xml:space="preserve">will be </w:t>
+      </w:r>
+      <w:r>
+        <w:rPr>
+          <w:rFonts w:eastAsia="Times New Roman" w:cs="Times New Roman"/>
+          <w:kern w:val="0"/>
+          <w14:ligatures w14:val="none"/>
+        </w:rPr>
+        <w:t>completed</w:t>
       </w:r>
       <w:r>
         <w:rPr>
@@ -123,7 +129,23 @@
           <w:kern w:val="0"/>
           <w14:ligatures w14:val="none"/>
         </w:rPr>
-        <w:t xml:space="preserve"> We can verify that the</w:t>
+        <w:t xml:space="preserve"> </w:t>
+      </w:r>
+      <w:r>
+        <w:rPr>
+          <w:rFonts w:eastAsia="Times New Roman" w:cs="Times New Roman"/>
+          <w:kern w:val="0"/>
+          <w14:ligatures w14:val="none"/>
+        </w:rPr>
+        <w:t>Verifying</w:t>
+      </w:r>
+      <w:r>
+        <w:rPr>
+          <w:rFonts w:eastAsia="Times New Roman" w:cs="Times New Roman"/>
+          <w:kern w:val="0"/>
+          <w14:ligatures w14:val="none"/>
+        </w:rPr>
+        <w:t xml:space="preserve"> that the</w:t>
       </w:r>
       <w:r>
         <w:rPr>
@@ -3455,6 +3477,7 @@
   <w:style w:type="character" w:default="1" w:styleId="DefaultParagraphFont">
     <w:name w:val="Default Paragraph Font"/>
     <w:uiPriority w:val="1"/>
+    <w:semiHidden/>
     <w:unhideWhenUsed/>
   </w:style>
   <w:style w:type="table" w:default="1" w:styleId="TableNormal">

</xml_diff>